<commit_message>
latest changes in pdfs
</commit_message>
<xml_diff>
--- a/Notes/S2/ADBMS/ADBMS study.docx
+++ b/Notes/S2/ADBMS/ADBMS study.docx
@@ -7,14 +7,32 @@
         <w:rPr>
           <w:b/>
           <w:bCs/>
+          <w:color w:val="EE0000"/>
         </w:rPr>
       </w:pPr>
       <w:r>
         <w:rPr>
           <w:b/>
           <w:bCs/>
+          <w:color w:val="EE0000"/>
+        </w:rPr>
+        <w:t xml:space="preserve">Q. </w:t>
+      </w:r>
+      <w:r>
+        <w:rPr>
+          <w:b/>
+          <w:bCs/>
+          <w:color w:val="EE0000"/>
         </w:rPr>
         <w:t>Importance of Multi-Valued Dependency (Simple Explanation)</w:t>
+      </w:r>
+      <w:r>
+        <w:rPr>
+          <w:b/>
+          <w:bCs/>
+          <w:color w:val="EE0000"/>
+        </w:rPr>
+        <w:t xml:space="preserve"> mod2</w:t>
       </w:r>
     </w:p>
     <w:p>
@@ -2504,6 +2522,7 @@
   <w:style w:type="character" w:default="1" w:styleId="DefaultParagraphFont">
     <w:name w:val="Default Paragraph Font"/>
     <w:uiPriority w:val="1"/>
+    <w:semiHidden/>
     <w:unhideWhenUsed/>
   </w:style>
   <w:style w:type="table" w:default="1" w:styleId="TableNormal">

</xml_diff>